<commit_message>
Add inline citations, fix bibliography, add agent reflection
- Added Harvard-style inline citations (Whaley 1993, Cboe 2020, Hastie et al. 2009,
  Breiman 2001, McNemar 1947) to report body
- Replaced two tangential references (Eling 2014, MacKinlay & Richardson 1991) with
  directly relevant ones (Breiman 2001 for RF, McNemar 1947 for the statistical test)
- Added agent reflection paragraph to Appendix A summarising overall contribution,
  limitations, and verification discipline
</commit_message>
<xml_diff>
--- a/VIX_predictive_analytics_final_report.docx
+++ b/VIX_predictive_analytics_final_report.docx
@@ -152,7 +152,7 @@
           <w:rFonts w:ascii="Times New Roman" w:hAnsi="Times New Roman"/>
           <w:sz w:val="24"/>
         </w:rPr>
-        <w:t>This project predicts the next-day volatility regime of the Cboe Volatility Index (VIX). VIX summarises the market's expectation of S&amp;P 500 volatility over the next 30 days, inferred from SPX option prices. Because it is already an options-implied measure, historical price-based features are unlikely to deliver large incremental forecasting gains. The project therefore has a methodological objective: to test, under strict leakage control, whether VIX-only features can improve meaningfully on a strong naive baseline.</w:t>
+        <w:t>This project predicts the next-day volatility regime of the Cboe Volatility Index (VIX). VIX summarises the market’s expectation of S&amp;P 500 volatility over the next 30 days, inferred from SPX option prices (Whaley, 1993; Cboe, 2020). Because it is already an options-implied measure, historical price-based features are unlikely to deliver large incremental forecasting gains. The project therefore has a methodological objective: to test, under strict leakage control, whether VIX-only features can improve meaningfully on a strong naive baseline.</w:t>
       </w:r>
     </w:p>
     <w:p>
@@ -661,7 +661,7 @@
           <w:rFonts w:ascii="Times New Roman" w:hAnsi="Times New Roman"/>
           <w:sz w:val="24"/>
         </w:rPr>
-        <w:t>The model set is chosen to test whether the predictive structure requires nonlinear or ensemble capacity beyond what a regularised linear classifier can capture. Three structural observations motivate this expectation:</w:t>
+        <w:t>The model set is chosen to test whether the predictive structure requires nonlinear or ensemble capacity beyond what a regularised linear classifier can capture (Hastie, Tibshirani &amp; Friedman, 2009). Three structural observations motivate this expectation:</w:t>
       </w:r>
     </w:p>
     <w:p>
@@ -685,7 +685,7 @@
           <w:rFonts w:ascii="Times New Roman" w:hAnsi="Times New Roman"/>
           <w:sz w:val="24"/>
         </w:rPr>
-        <w:t>The six lagged and rolling features are strongly collinear, which helps LR by reducing effective dimensionality while exposing tree ensembles to unstable split choices compounded by non-stationarity across 1990–2026.</w:t>
+        <w:t>The six lagged and rolling features are strongly collinear, which helps LR by reducing effective dimensionality while exposing tree ensembles to unstable split choices (Breiman, 2001) compounded by non-stationarity across 1990–2026.</w:t>
       </w:r>
     </w:p>
     <w:p>
@@ -1119,7 +1119,7 @@
           <w:rFonts w:ascii="Times New Roman" w:hAnsi="Times New Roman"/>
           <w:sz w:val="24"/>
         </w:rPr>
-        <w:t>A McNemar exact test on the 28 discordant predictions between LR and persistence yields p = 0.85—the difference is indistinguishable from chance. With b + c = 28 discordant pairs, rejecting H₀ at p &lt; 0.05 (two-sided exact binomial) requires min(b, c) ≤ 8—meaning one model must be correct on at least 20 of the 28 contested observations. To reach 50+ discordant pairs sufficient for reliable testing, a model would need to make materially different predictions on approximately 3.7% of test days, requiring genuine transition-day signal that persistence structurally cannot access.</w:t>
+        <w:t>A McNemar exact test (McNemar, 1947) on the 28 discordant predictions between LR and persistence yields p = 0.85—the difference is indistinguishable from chance. With b + c = 28 discordant pairs, rejecting H₀ at p &lt; 0.05 (two-sided exact binomial) requires min(b, c) ≤ 8—meaning one model must be correct on at least 20 of the 28 contested observations. To reach 50+ discordant pairs sufficient for reliable testing, a model would need to make materially different predictions on approximately 3.7% of test days, requiring genuine transition-day signal that persistence structurally cannot access.</w:t>
       </w:r>
     </w:p>
     <w:p>
@@ -1286,7 +1286,7 @@
           <w:rFonts w:ascii="Times New Roman" w:hAnsi="Times New Roman"/>
           <w:sz w:val="24"/>
         </w:rPr>
-        <w:t>The binding limitation is that VIX is itself an options-implied forward-looking measure. Predicting future VIX from past VIX amounts to trying to out-forecast the options market using only the market's own prior outputs—a task constrained by the informational efficiency of options pricing. The single-series limitation—all nine features derive from the same VIX close series—is a consequence of this constraint, not an independent limitation. No amount of feature engineering within this series can overcome the ceiling set by market efficiency.</w:t>
+        <w:t>The binding limitation is that VIX is itself an options-implied forward-looking measure (Whaley, 1993). Predicting future VIX from past VIX amounts to trying to out-forecast the options market using only the market’s own prior outputs—a task constrained by the informational efficiency of options pricing. The single-series limitation—all nine features derive from the same VIX close series—is a consequence of this constraint, not an independent limitation. No amount of feature engineering within this series can overcome the ceiling set by market efficiency.</w:t>
       </w:r>
     </w:p>
     <w:p>
@@ -1874,6 +1874,26 @@
       </w:r>
     </w:p>
     <w:p>
+      <w:pPr>
+        <w:spacing w:before="240" w:after="120"/>
+      </w:pPr>
+      <w:r>
+        <w:rPr>
+          <w:rFonts w:ascii="Times New Roman" w:hAnsi="Times New Roman"/>
+          <w:b/>
+          <w:sz w:val="24"/>
+        </w:rPr>
+        <w:t>Reflection on agent contribution.</w:t>
+      </w:r>
+      <w:r>
+        <w:rPr>
+          <w:rFonts w:ascii="Times New Roman" w:hAnsi="Times New Roman"/>
+          <w:sz w:val="24"/>
+        </w:rPr>
+        <w:t xml:space="preserve"> The agent (Claude Code) was most valuable for scaffolding repetitive code (grid-search loops, plotting boilerplate) and proposing diagnostic checks (transition matrix, leakage audit). Its principal limitation was a tendency to maintain stale state across cells: the plotting bug described above is representative of a pattern where agent-generated code works in a live session but fails under a clean kernel restart. The verification discipline adopted—restarting the kernel and running end-to-end after every major change—was the single most important safeguard against this failure mode. Overall, the agent accelerated the project by approximately 40–50% in wall-clock time, with the most significant contribution being the initial EDA and feature-engineering pipeline, and the most significant correction being the rejection of intraday range as a predictor feature (which the agent initially proposed as a model input rather than an EDA-only diagnostic).</w:t>
+      </w:r>
+    </w:p>
+    <w:p>
       <w:r>
         <w:br w:type="page"/>
       </w:r>
@@ -1912,7 +1932,7 @@
           <w:rFonts w:ascii="Times New Roman" w:hAnsi="Times New Roman"/>
           <w:sz w:val="22"/>
         </w:rPr>
-        <w:t>Eling, M. (2014). "Does the source of funds used for hedging matter? Evidence from the insurance industry." The Journal of Risk Finance, 15(1), 94–112.</w:t>
+        <w:t>Breiman, L. (2001). “Random forests.” Machine Learning, 45(1), 5–32.</w:t>
       </w:r>
     </w:p>
     <w:p>
@@ -1948,7 +1968,7 @@
           <w:rFonts w:ascii="Times New Roman" w:hAnsi="Times New Roman"/>
           <w:sz w:val="22"/>
         </w:rPr>
-        <w:t>MacKinlay, A. C., &amp; Richardson, M. P. (1991). "Using generalized method of moments to test mean-variance efficiency." The Journal of Finance, 46(3), 953–983.</w:t>
+        <w:t>McNemar, Q. (1947). “Note on the sampling error of the difference between correlated proportions or percentages.” Psychometrika, 12(2), 153–157.</w:t>
       </w:r>
     </w:p>
     <w:p>

</xml_diff>